<commit_message>
0.23.0: theme colours: BCTU colour scheme in the template, theme-colours YAML key, repair_report_docx(theme_colours)
</commit_message>
<xml_diff>
--- a/inst/rmarkdown/templates/report/resources/reference.docx
+++ b/inst/rmarkdown/templates/report/resources/reference.docx
@@ -703,7 +703,7 @@
       <w:rFonts w:ascii="Arial" w:hAnsi="Arial"/>
       <w:b/>
       <w:bCs/>
-      <w:color w:val="3C3C3B"/>
+      <w:color w:val="3C3C3B" w:themeColor="text2"/>
       <w:sz w:val="22"/>
       <w:szCs w:val="22"/>
     </w:rPr>
@@ -716,7 +716,7 @@
       <w:rFonts w:ascii="Arial" w:hAnsi="Arial"/>
       <w:b/>
       <w:bCs/>
-      <w:color w:val="3C3C3B"/>
+      <w:color w:val="3C3C3B" w:themeColor="text2"/>
       <w:sz w:val="22"/>
       <w:szCs w:val="22"/>
     </w:rPr>
@@ -737,7 +737,7 @@
       <w:rFonts w:ascii="Arial" w:hAnsi="Arial"/>
       <w:i/>
       <w:iCs/>
-      <w:color w:val="3C3C3B"/>
+      <w:color w:val="3C3C3B" w:themeColor="text2"/>
       <w:sz w:val="22"/>
       <w:szCs w:val="22"/>
     </w:rPr>
@@ -750,7 +750,7 @@
       <w:rFonts w:ascii="Arial" w:hAnsi="Arial"/>
       <w:i/>
       <w:iCs/>
-      <w:color w:val="3C3C3B"/>
+      <w:color w:val="3C3C3B" w:themeColor="text2"/>
       <w:sz w:val="22"/>
       <w:szCs w:val="22"/>
     </w:rPr>
@@ -938,7 +938,7 @@
     </w:pPr>
     <w:rPr>
       <w:rFonts w:ascii="Arial" w:hAnsi="Arial"/>
-      <w:color w:val="3C3C3B"/>
+      <w:color w:val="3C3C3B" w:themeColor="text2"/>
       <w:sz w:val="22"/>
       <w:szCs w:val="22"/>
     </w:rPr>
@@ -952,7 +952,7 @@
       <w:keepNext/>
       <w:keepLines/>
       <w:pBdr>
-        <w:top w:val="single" w:sz="12" w:space="6" w:color="C59A00"/>
+        <w:top w:val="single" w:sz="12" w:space="6" w:color="C59A00" w:themeColor="accent1"/>
       </w:pBdr>
       <w:spacing w:before="120" w:after="120"/>
     </w:pPr>
@@ -977,7 +977,7 @@
       <w:rFonts w:ascii="Arial" w:hAnsi="Arial"/>
       <w:i/>
       <w:iCs/>
-      <w:color w:val="3C3C3B"/>
+      <w:color w:val="3C3C3B" w:themeColor="text2"/>
       <w:sz w:val="28"/>
       <w:szCs w:val="28"/>
     </w:rPr>
@@ -1014,8 +1014,8 @@
     <w:qFormat/>
     <w:pPr>
       <w:pBdr>
-        <w:top w:val="single" w:sz="12" w:space="1" w:color="C59A00"/>
-        <w:bottom w:val="single" w:sz="12" w:space="1" w:color="C59A00"/>
+        <w:top w:val="single" w:sz="12" w:space="1" w:color="C59A00" w:themeColor="accent1"/>
+        <w:bottom w:val="single" w:sz="12" w:space="1" w:color="C59A00" w:themeColor="accent1"/>
       </w:pBdr>
       <w:spacing w:before="240" w:after="240" w:line="360" w:lineRule="auto"/>
       <w:ind w:left="862" w:right="862"/>
@@ -1040,7 +1040,7 @@
       <w:rFonts w:ascii="Arial" w:hAnsi="Arial"/>
       <w:i/>
       <w:iCs/>
-      <w:color w:val="3C3C3B"/>
+      <w:color w:val="3C3C3B" w:themeColor="text2"/>
       <w:sz w:val="20"/>
       <w:szCs w:val="20"/>
     </w:rPr>
@@ -1173,7 +1173,7 @@
     <w:name w:val="Hyperlink"/>
     <w:basedOn w:val="DefaultParagraphFont"/>
     <w:rPr>
-      <w:color w:val="0057BF"/>
+      <w:color w:val="0057BF" w:themeColor="hyperlink"/>
       <w:u w:val="single"/>
     </w:rPr>
   </w:style>
@@ -1445,9 +1445,9 @@
     <w:tblPr>
       <w:tblInd w:w="0" w:type="dxa"/>
       <w:tblBorders>
-        <w:top w:val="single" w:sz="6" w:color="C59A00"/>
-        <w:bottom w:val="single" w:sz="6" w:color="C59A00"/>
-        <w:insideH w:val="single" w:sz="4" w:color="BFBFBF"/>
+        <w:top w:val="single" w:sz="6" w:color="C59A00" w:themeColor="accent1"/>
+        <w:bottom w:val="single" w:sz="6" w:color="C59A00" w:themeColor="accent1"/>
+        <w:insideH w:val="single" w:sz="4" w:color="BFBFBF" w:themeColor="background1" w:themeShade="BF"/>
       </w:tblBorders>
       <w:tblCellMar>
         <w:top w:w="80" w:type="dxa"/>
@@ -1464,9 +1464,9 @@
       </w:rPr>
       <w:tblPr/>
       <w:tcPr>
-        <w:shd w:val="clear" w:color="auto" w:fill="F5EDD4"/>
+        <w:shd w:val="clear" w:color="auto" w:fill="F5EDD4" w:themeFill="accent1" w:themeFillTint="33"/>
         <w:tcBorders>
-          <w:bottom w:val="single" w:sz="8" w:color="C59A00"/>
+          <w:bottom w:val="single" w:sz="8" w:color="C59A00" w:themeColor="accent1"/>
         </w:tcBorders>
       </w:tcPr>
     </w:tblStylePr>
@@ -1477,7 +1477,7 @@
 <file path=word/theme/theme1.xml><?xml version="1.0" encoding="utf-8"?>
 <a:theme xmlns:a="http://schemas.openxmlformats.org/drawingml/2006/main" name="Office Theme">
   <a:themeElements>
-    <a:clrScheme name="Office">
+    <a:clrScheme name="BCTU">
       <a:dk1>
         <a:sysClr val="windowText" lastClr="000000"/>
       </a:dk1>
@@ -1485,34 +1485,34 @@
         <a:sysClr val="window" lastClr="FFFFFF"/>
       </a:lt1>
       <a:dk2>
-        <a:srgbClr val="1F497D"/>
+        <a:srgbClr val="3C3C3B"/>
       </a:dk2>
       <a:lt2>
-        <a:srgbClr val="EEECE1"/>
+        <a:srgbClr val="F5EDD4"/>
       </a:lt2>
       <a:accent1>
-        <a:srgbClr val="4F81BD"/>
+        <a:srgbClr val="C59A00"/>
       </a:accent1>
       <a:accent2>
-        <a:srgbClr val="C0504D"/>
+        <a:srgbClr val="0057BF"/>
       </a:accent2>
       <a:accent3>
-        <a:srgbClr val="9BBB59"/>
+        <a:srgbClr val="007838"/>
       </a:accent3>
       <a:accent4>
-        <a:srgbClr val="8064A2"/>
+        <a:srgbClr val="501D83"/>
       </a:accent4>
       <a:accent5>
-        <a:srgbClr val="4BACC6"/>
+        <a:srgbClr val="CF4527"/>
       </a:accent5>
       <a:accent6>
-        <a:srgbClr val="F79646"/>
+        <a:srgbClr val="00788E"/>
       </a:accent6>
       <a:hlink>
-        <a:srgbClr val="0000FF"/>
+        <a:srgbClr val="0057BF"/>
       </a:hlink>
       <a:folHlink>
-        <a:srgbClr val="800080"/>
+        <a:srgbClr val="501D83"/>
       </a:folHlink>
     </a:clrScheme>
     <a:fontScheme name="Office">

</xml_diff>

<commit_message>
0.23.0: report_theme() with inheriting elements, named templates, filled table of contents
</commit_message>
<xml_diff>
--- a/inst/rmarkdown/templates/report/resources/reference.docx
+++ b/inst/rmarkdown/templates/report/resources/reference.docx
@@ -146,7 +146,7 @@
   <w:p>
     <w:pPr>
       <w:pBdr>
-        <w:bottom w:val="single" w:sz="4" w:space="1" w:color="C59A00"/>
+        <w:bottom w:val="single" w:sz="4" w:space="1" w:color="C59A00" w:themeColor="accent2"/>
       </w:pBdr>
       <w:tabs>
         <w:tab w:val="right" w:pos="9360"/>
@@ -952,7 +952,7 @@
       <w:keepNext/>
       <w:keepLines/>
       <w:pBdr>
-        <w:top w:val="single" w:sz="12" w:space="6" w:color="C59A00" w:themeColor="accent1"/>
+        <w:top w:val="single" w:sz="12" w:space="6" w:color="C59A00" w:themeColor="accent2"/>
       </w:pBdr>
       <w:spacing w:before="120" w:after="120"/>
     </w:pPr>
@@ -1014,8 +1014,8 @@
     <w:qFormat/>
     <w:pPr>
       <w:pBdr>
-        <w:top w:val="single" w:sz="12" w:space="1" w:color="C59A00" w:themeColor="accent1"/>
-        <w:bottom w:val="single" w:sz="12" w:space="1" w:color="C59A00" w:themeColor="accent1"/>
+        <w:top w:val="single" w:sz="12" w:space="1" w:color="C59A00" w:themeColor="accent2"/>
+        <w:bottom w:val="single" w:sz="12" w:space="1" w:color="C59A00" w:themeColor="accent2"/>
       </w:pBdr>
       <w:spacing w:before="240" w:after="240" w:line="360" w:lineRule="auto"/>
       <w:ind w:left="862" w:right="862"/>
@@ -1445,8 +1445,8 @@
     <w:tblPr>
       <w:tblInd w:w="0" w:type="dxa"/>
       <w:tblBorders>
-        <w:top w:val="single" w:sz="6" w:color="C59A00" w:themeColor="accent1"/>
-        <w:bottom w:val="single" w:sz="6" w:color="C59A00" w:themeColor="accent1"/>
+        <w:top w:val="single" w:sz="6" w:color="C59A00" w:themeColor="accent3"/>
+        <w:bottom w:val="single" w:sz="6" w:color="C59A00" w:themeColor="accent3"/>
         <w:insideH w:val="single" w:sz="4" w:color="BFBFBF" w:themeColor="background1" w:themeShade="BF"/>
       </w:tblBorders>
       <w:tblCellMar>
@@ -1464,12 +1464,58 @@
       </w:rPr>
       <w:tblPr/>
       <w:tcPr>
-        <w:shd w:val="clear" w:color="auto" w:fill="F5EDD4" w:themeFill="accent1" w:themeFillTint="33"/>
+        <w:shd w:val="clear" w:color="auto" w:fill="F3EBCC" w:themeFill="accent1"/>
         <w:tcBorders>
-          <w:bottom w:val="single" w:sz="8" w:color="C59A00" w:themeColor="accent1"/>
+          <w:bottom w:val="single" w:sz="8" w:color="C59A00" w:themeColor="accent3"/>
         </w:tcBorders>
       </w:tcPr>
     </w:tblStylePr>
+  </w:style>
+  <w:style w:type="paragraph" w:styleId="TOC1">
+    <w:name w:val="toc 1"/>
+    <w:basedOn w:val="Normal"/>
+    <w:next w:val="Normal"/>
+    <w:uiPriority w:val="39"/>
+    <w:pPr>
+      <w:tabs>
+        <w:tab w:val="left" w:pos="480"/>
+        <w:tab w:val="right" w:leader="dot" w:pos="9026"/>
+      </w:tabs>
+      <w:spacing w:before="0" w:after="60"/>
+      <w:ind w:left="480" w:hanging="480"/>
+    </w:pPr>
+    <w:rPr>
+      <w:b/>
+      <w:bCs/>
+    </w:rPr>
+  </w:style>
+  <w:style w:type="paragraph" w:styleId="TOC2">
+    <w:name w:val="toc 2"/>
+    <w:basedOn w:val="Normal"/>
+    <w:next w:val="Normal"/>
+    <w:uiPriority w:val="39"/>
+    <w:pPr>
+      <w:tabs>
+        <w:tab w:val="left" w:pos="1160"/>
+        <w:tab w:val="right" w:leader="dot" w:pos="9026"/>
+      </w:tabs>
+      <w:spacing w:before="0" w:after="60"/>
+      <w:ind w:left="1160" w:hanging="680"/>
+    </w:pPr>
+  </w:style>
+  <w:style w:type="paragraph" w:styleId="TOC3">
+    <w:name w:val="toc 3"/>
+    <w:basedOn w:val="Normal"/>
+    <w:next w:val="Normal"/>
+    <w:uiPriority w:val="39"/>
+    <w:pPr>
+      <w:tabs>
+        <w:tab w:val="left" w:pos="1960"/>
+        <w:tab w:val="right" w:leader="dot" w:pos="9026"/>
+      </w:tabs>
+      <w:spacing w:before="0" w:after="60"/>
+      <w:ind w:left="1960" w:hanging="800"/>
+    </w:pPr>
   </w:style>
 </w:styles>
 </file>
@@ -1491,22 +1537,22 @@
         <a:srgbClr val="F5EDD4"/>
       </a:lt2>
       <a:accent1>
-        <a:srgbClr val="C59A00"/>
+        <a:srgbClr val="F3EBCC"/>
       </a:accent1>
       <a:accent2>
-        <a:srgbClr val="0057BF"/>
+        <a:srgbClr val="C59A00"/>
       </a:accent2>
       <a:accent3>
-        <a:srgbClr val="007838"/>
+        <a:srgbClr val="C59A00"/>
       </a:accent3>
       <a:accent4>
-        <a:srgbClr val="501D83"/>
+        <a:srgbClr val="0057BF"/>
       </a:accent4>
       <a:accent5>
-        <a:srgbClr val="CF4527"/>
+        <a:srgbClr val="007838"/>
       </a:accent5>
       <a:accent6>
-        <a:srgbClr val="00788E"/>
+        <a:srgbClr val="501D83"/>
       </a:accent6>
       <a:hlink>
         <a:srgbClr val="0057BF"/>

</xml_diff>

<commit_message>
0.23.0: TOC level 1 not bold, as Word's default
</commit_message>
<xml_diff>
--- a/inst/rmarkdown/templates/report/resources/reference.docx
+++ b/inst/rmarkdown/templates/report/resources/reference.docx
@@ -1484,10 +1484,6 @@
       <w:spacing w:before="0" w:after="60"/>
       <w:ind w:left="480" w:hanging="480"/>
     </w:pPr>
-    <w:rPr>
-      <w:b/>
-      <w:bCs/>
-    </w:rPr>
   </w:style>
   <w:style w:type="paragraph" w:styleId="TOC2">
     <w:name w:val="toc 2"/>

</xml_diff>

<commit_message>
0.23.0: no dirty fields anywhere, so Word never asks to update on opening
</commit_message>
<xml_diff>
--- a/inst/rmarkdown/templates/report/resources/reference.docx
+++ b/inst/rmarkdown/templates/report/resources/reference.docx
@@ -163,7 +163,7 @@
         <w:color w:val="3C3C3B"/>
         <w:sz w:val="20"/>
       </w:rPr>
-      <w:fldChar w:fldCharType="begin" w:dirty="true"/>
+      <w:fldChar w:fldCharType="begin"/>
     </w:r>
     <w:r>
       <w:rPr>
@@ -205,7 +205,7 @@
         <w:color w:val="3C3C3B"/>
         <w:sz w:val="20"/>
       </w:rPr>
-      <w:fldChar w:fldCharType="begin" w:dirty="true"/>
+      <w:fldChar w:fldCharType="begin"/>
     </w:r>
     <w:r>
       <w:rPr>
@@ -240,7 +240,7 @@
         <w:color w:val="3C3C3B"/>
         <w:sz w:val="20"/>
       </w:rPr>
-      <w:fldChar w:fldCharType="begin" w:dirty="true"/>
+      <w:fldChar w:fldCharType="begin"/>
     </w:r>
     <w:r>
       <w:rPr>

</xml_diff>

<commit_message>
0.26.0: trial logo on the title page (trial-logo, trial-logo-width)
</commit_message>
<xml_diff>
--- a/inst/rmarkdown/templates/report/resources/reference.docx
+++ b/inst/rmarkdown/templates/report/resources/reference.docx
@@ -1511,6 +1511,15 @@
       </w:tabs>
       <w:spacing w:before="0" w:after="60"/>
       <w:ind w:left="1960" w:hanging="800"/>
+    </w:pPr>
+  </w:style>
+  <w:style w:type="paragraph" w:customStyle="1" w:styleId="TitleLogo">
+    <w:name w:val="Title Logo"/>
+    <w:basedOn w:val="Normal"/>
+    <w:qFormat/>
+    <w:pPr>
+      <w:spacing w:before="0" w:after="0"/>
+      <w:jc w:val="right"/>
     </w:pPr>
   </w:style>
 </w:styles>

</xml_diff>

<commit_message>
0.26.1: trial logo centred below the header band, fitted to trial-logo-width by trial-logo-height with aspect ratio kept
</commit_message>
<xml_diff>
--- a/inst/rmarkdown/templates/report/resources/reference.docx
+++ b/inst/rmarkdown/templates/report/resources/reference.docx
@@ -1518,8 +1518,8 @@
     <w:basedOn w:val="Normal"/>
     <w:qFormat/>
     <w:pPr>
-      <w:spacing w:before="0" w:after="0"/>
-      <w:jc w:val="right"/>
+      <w:spacing w:before="864" w:beforeAutospacing="0" w:after="0"/>
+      <w:jc w:val="center"/>
     </w:pPr>
   </w:style>
 </w:styles>

</xml_diff>